<commit_message>
docs: add the executive summary in PDF and Word
</commit_message>
<xml_diff>
--- a/docs/implementacion.docx
+++ b/docs/implementacion.docx
@@ -282,16 +282,77 @@
     </w:p>
     <w:p>
       <w:pPr>
+        <w:pStyle w:val="BlockText"/>
+      </w:pPr>
+      <w:r>
+        <w:rPr>
+          <w:b/>
+          <w:bCs/>
+          <w:lang w:val="es"/>
+        </w:rPr>
+        <w:t xml:space="preserve">Versiones para compartir:</w:t>
+      </w:r>
+      <w:r>
+        <w:rPr>
+          <w:lang w:val="es"/>
+        </w:rPr>
+        <w:t xml:space="preserve"> </w:t>
+      </w:r>
+      <w:hyperlink r:id="rId12">
+        <w:r>
+          <w:rPr>
+            <w:rStyle w:val="Hyperlink"/>
+            <w:lang w:val="es"/>
+          </w:rPr>
+          <w:t xml:space="preserve">PDF</w:t>
+        </w:r>
+      </w:hyperlink>
+      <w:r>
+        <w:rPr>
+          <w:lang w:val="es"/>
+        </w:rPr>
+        <w:t xml:space="preserve"> </w:t>
+      </w:r>
+      <w:r>
+        <w:rPr>
+          <w:lang w:val="es"/>
+        </w:rPr>
+        <w:t xml:space="preserve">·</w:t>
+      </w:r>
+      <w:r>
+        <w:rPr>
+          <w:lang w:val="es"/>
+        </w:rPr>
+        <w:t xml:space="preserve"> </w:t>
+      </w:r>
+      <w:hyperlink r:id="rId13">
+        <w:r>
+          <w:rPr>
+            <w:rStyle w:val="Hyperlink"/>
+            <w:lang w:val="es"/>
+          </w:rPr>
+          <w:t xml:space="preserve">Word</w:t>
+        </w:r>
+      </w:hyperlink>
+      <w:r>
+        <w:rPr>
+          <w:lang w:val="es"/>
+        </w:rPr>
+        <w:t xml:space="preserve">.</w:t>
+      </w:r>
+    </w:p>
+    <w:p>
+      <w:pPr>
         <w:pStyle w:val="Heading2"/>
       </w:pPr>
-      <w:bookmarkStart w:id="12" w:name="_61e6233f7e293a2a3698c54479a4761d1824448"/>
+      <w:bookmarkStart w:id="14" w:name="_61e6233f7e293a2a3698c54479a4761d1824448"/>
       <w:r>
         <w:rPr>
           <w:lang w:val="es"/>
         </w:rPr>
         <w:t xml:space="preserve">1. Vista general</w:t>
       </w:r>
-      <w:bookmarkEnd w:id="12"/>
+      <w:bookmarkEnd w:id="14"/>
     </w:p>
     <w:tbl>
       <w:tblPr>
@@ -964,14 +1025,14 @@
       <w:pPr>
         <w:pStyle w:val="Heading2"/>
       </w:pPr>
-      <w:bookmarkStart w:id="13" w:name="_41ac43cd492ec8b42f03a1a961d3b9fe68d1d15"/>
+      <w:bookmarkStart w:id="15" w:name="_41ac43cd492ec8b42f03a1a961d3b9fe68d1d15"/>
       <w:r>
         <w:rPr>
           <w:lang w:val="es"/>
         </w:rPr>
         <w:t xml:space="preserve">2. Organización del código y capas</w:t>
       </w:r>
-      <w:bookmarkEnd w:id="13"/>
+      <w:bookmarkEnd w:id="15"/>
     </w:p>
     <w:p>
       <w:pPr>
@@ -1554,20 +1615,20 @@
       <w:pPr>
         <w:pStyle w:val="Heading2"/>
       </w:pPr>
-      <w:bookmarkStart w:id="14" w:name="_651e9882dfcda573159d30a840af9f0221c9aaf"/>
+      <w:bookmarkStart w:id="16" w:name="_651e9882dfcda573159d30a840af9f0221c9aaf"/>
       <w:r>
         <w:rPr>
           <w:lang w:val="es"/>
         </w:rPr>
         <w:t xml:space="preserve">3. Backend, app por app</w:t>
       </w:r>
-      <w:bookmarkEnd w:id="14"/>
+      <w:bookmarkEnd w:id="16"/>
     </w:p>
     <w:p>
       <w:pPr>
         <w:pStyle w:val="Heading3"/>
       </w:pPr>
-      <w:bookmarkStart w:id="15" w:name="_71a928dca031337c0e3224439ece5e5c7616490"/>
+      <w:bookmarkStart w:id="17" w:name="_71a928dca031337c0e3224439ece5e5c7616490"/>
       <w:r>
         <w:rPr>
           <w:lang w:val="es"/>
@@ -1599,7 +1660,7 @@
         </w:rPr>
         <w:t xml:space="preserve">— utilidades transversales</w:t>
       </w:r>
-      <w:bookmarkEnd w:id="15"/>
+      <w:bookmarkEnd w:id="17"/>
     </w:p>
     <w:tbl>
       <w:tblPr>
@@ -2457,7 +2518,7 @@
       <w:pPr>
         <w:pStyle w:val="Heading3"/>
       </w:pPr>
-      <w:bookmarkStart w:id="16" w:name="_9bd3950dfe37b552a2d26f4fcbfdfff6517fc24"/>
+      <w:bookmarkStart w:id="18" w:name="_9bd3950dfe37b552a2d26f4fcbfdfff6517fc24"/>
       <w:r>
         <w:rPr>
           <w:lang w:val="es"/>
@@ -2489,7 +2550,7 @@
         </w:rPr>
         <w:t xml:space="preserve">— usuarios, sesión, KYC</w:t>
       </w:r>
-      <w:bookmarkEnd w:id="16"/>
+      <w:bookmarkEnd w:id="18"/>
     </w:p>
     <w:p>
       <w:pPr>
@@ -3901,7 +3962,7 @@
       <w:pPr>
         <w:pStyle w:val="Heading3"/>
       </w:pPr>
-      <w:bookmarkStart w:id="17" w:name="_a60330902a6dc23dc1e9cc77463cb18e0b92936"/>
+      <w:bookmarkStart w:id="19" w:name="_a60330902a6dc23dc1e9cc77463cb18e0b92936"/>
       <w:r>
         <w:rPr>
           <w:lang w:val="es"/>
@@ -3933,7 +3994,7 @@
         </w:rPr>
         <w:t xml:space="preserve">— libro mayor de doble entrada</w:t>
       </w:r>
-      <w:bookmarkEnd w:id="17"/>
+      <w:bookmarkEnd w:id="19"/>
     </w:p>
     <w:p>
       <w:pPr>
@@ -5479,7 +5540,7 @@
       <w:pPr>
         <w:pStyle w:val="Heading3"/>
       </w:pPr>
-      <w:bookmarkStart w:id="18" w:name="_f48314a7a51676bd3b43745d88a42112a2595d8"/>
+      <w:bookmarkStart w:id="20" w:name="_f48314a7a51676bd3b43745d88a42112a2595d8"/>
       <w:r>
         <w:rPr>
           <w:lang w:val="es"/>
@@ -5511,7 +5572,7 @@
         </w:rPr>
         <w:t xml:space="preserve">— intención de pago y webhooks</w:t>
       </w:r>
-      <w:bookmarkEnd w:id="18"/>
+      <w:bookmarkEnd w:id="20"/>
     </w:p>
     <w:p>
       <w:pPr>
@@ -6430,7 +6491,7 @@
       <w:pPr>
         <w:pStyle w:val="Heading3"/>
       </w:pPr>
-      <w:bookmarkStart w:id="19" w:name="_0a16338f1cd4141dfa289b866ef608495390465"/>
+      <w:bookmarkStart w:id="21" w:name="_0a16338f1cd4141dfa289b866ef608495390465"/>
       <w:r>
         <w:rPr>
           <w:lang w:val="es"/>
@@ -6462,7 +6523,7 @@
         </w:rPr>
         <w:t xml:space="preserve">— ofertas de préstamo</w:t>
       </w:r>
-      <w:bookmarkEnd w:id="19"/>
+      <w:bookmarkEnd w:id="21"/>
     </w:p>
     <w:p>
       <w:pPr>
@@ -6954,7 +7015,7 @@
       <w:pPr>
         <w:pStyle w:val="Heading3"/>
       </w:pPr>
-      <w:bookmarkStart w:id="20" w:name="_0fc2d2e967a3cdbdf58d21e3609ec39544d5131"/>
+      <w:bookmarkStart w:id="22" w:name="_0fc2d2e967a3cdbdf58d21e3609ec39544d5131"/>
       <w:r>
         <w:rPr>
           <w:lang w:val="es"/>
@@ -6986,7 +7047,7 @@
         </w:rPr>
         <w:t xml:space="preserve">— búsqueda y comparación (solo lectura)</w:t>
       </w:r>
-      <w:bookmarkEnd w:id="20"/>
+      <w:bookmarkEnd w:id="22"/>
     </w:p>
     <w:p>
       <w:pPr>
@@ -7135,7 +7196,7 @@
       <w:pPr>
         <w:pStyle w:val="Heading3"/>
       </w:pPr>
-      <w:bookmarkStart w:id="21" w:name="_0e61af7dd4c728f0d55810db64b4870dbb90447"/>
+      <w:bookmarkStart w:id="23" w:name="_0e61af7dd4c728f0d55810db64b4870dbb90447"/>
       <w:r>
         <w:rPr>
           <w:lang w:val="es"/>
@@ -7167,7 +7228,7 @@
         </w:rPr>
         <w:t xml:space="preserve">— préstamos y cuotas</w:t>
       </w:r>
-      <w:bookmarkEnd w:id="21"/>
+      <w:bookmarkEnd w:id="23"/>
     </w:p>
     <w:p>
       <w:pPr>
@@ -7759,7 +7820,7 @@
       <w:pPr>
         <w:pStyle w:val="Heading3"/>
       </w:pPr>
-      <w:bookmarkStart w:id="22" w:name="_80a320c09f1e0f6fc32ed0446c150bb0515aead"/>
+      <w:bookmarkStart w:id="24" w:name="_80a320c09f1e0f6fc32ed0446c150bb0515aead"/>
       <w:r>
         <w:rPr>
           <w:lang w:val="es"/>
@@ -7791,7 +7852,7 @@
         </w:rPr>
         <w:t xml:space="preserve">— plazos fijos</w:t>
       </w:r>
-      <w:bookmarkEnd w:id="22"/>
+      <w:bookmarkEnd w:id="24"/>
     </w:p>
     <w:p>
       <w:pPr>
@@ -8124,7 +8185,7 @@
       <w:pPr>
         <w:pStyle w:val="Heading3"/>
       </w:pPr>
-      <w:bookmarkStart w:id="23" w:name="_8917a9e646c462cf9c225c546908f88353eda70"/>
+      <w:bookmarkStart w:id="25" w:name="_8917a9e646c462cf9c225c546908f88353eda70"/>
       <w:r>
         <w:rPr>
           <w:lang w:val="es"/>
@@ -8156,7 +8217,7 @@
         </w:rPr>
         <w:t xml:space="preserve">— presupuestos y gastos</w:t>
       </w:r>
-      <w:bookmarkEnd w:id="23"/>
+      <w:bookmarkEnd w:id="25"/>
     </w:p>
     <w:p>
       <w:pPr>
@@ -8605,7 +8666,7 @@
       <w:pPr>
         <w:pStyle w:val="Heading3"/>
       </w:pPr>
-      <w:bookmarkStart w:id="24" w:name="_65e45981221c3e6d477e149bc32febf1bb9bdc9"/>
+      <w:bookmarkStart w:id="26" w:name="_65e45981221c3e6d477e149bc32febf1bb9bdc9"/>
       <w:r>
         <w:rPr>
           <w:lang w:val="es"/>
@@ -8637,7 +8698,7 @@
         </w:rPr>
         <w:t xml:space="preserve">— reportes y CSV</w:t>
       </w:r>
-      <w:bookmarkEnd w:id="24"/>
+      <w:bookmarkEnd w:id="26"/>
     </w:p>
     <w:p>
       <w:pPr>
@@ -8927,7 +8988,7 @@
       <w:pPr>
         <w:pStyle w:val="Heading3"/>
       </w:pPr>
-      <w:bookmarkStart w:id="25" w:name="_d8c9c5ce05bab9a9aaeafc91fc90a82facb208e"/>
+      <w:bookmarkStart w:id="27" w:name="_d8c9c5ce05bab9a9aaeafc91fc90a82facb208e"/>
       <w:r>
         <w:rPr>
           <w:lang w:val="es"/>
@@ -8959,7 +9020,7 @@
         </w:rPr>
         <w:t xml:space="preserve">— avisos por email</w:t>
       </w:r>
-      <w:bookmarkEnd w:id="25"/>
+      <w:bookmarkEnd w:id="27"/>
     </w:p>
     <w:p>
       <w:pPr>
@@ -9559,7 +9620,7 @@
       <w:pPr>
         <w:pStyle w:val="Heading3"/>
       </w:pPr>
-      <w:bookmarkStart w:id="26" w:name="_4c5e46e32a04c86381b8be81e0fec8ba016c37c"/>
+      <w:bookmarkStart w:id="28" w:name="_4c5e46e32a04c86381b8be81e0fec8ba016c37c"/>
       <w:r>
         <w:rPr>
           <w:lang w:val="es"/>
@@ -9591,7 +9652,7 @@
         </w:rPr>
         <w:t xml:space="preserve">— Presti, sin LLM</w:t>
       </w:r>
-      <w:bookmarkEnd w:id="26"/>
+      <w:bookmarkEnd w:id="28"/>
     </w:p>
     <w:p>
       <w:pPr>
@@ -10051,7 +10112,7 @@
       <w:pPr>
         <w:pStyle w:val="Heading3"/>
       </w:pPr>
-      <w:bookmarkStart w:id="27" w:name="_e0d6b436e615a7fd0e81c2929d1ba4d38597116"/>
+      <w:bookmarkStart w:id="29" w:name="_e0d6b436e615a7fd0e81c2929d1ba4d38597116"/>
       <w:r>
         <w:rPr>
           <w:lang w:val="es"/>
@@ -10083,7 +10144,7 @@
         </w:rPr>
         <w:t xml:space="preserve">— datos de demostración</w:t>
       </w:r>
-      <w:bookmarkEnd w:id="27"/>
+      <w:bookmarkEnd w:id="29"/>
     </w:p>
     <w:p>
       <w:pPr>
@@ -10314,14 +10375,14 @@
       <w:pPr>
         <w:pStyle w:val="Heading2"/>
       </w:pPr>
-      <w:bookmarkStart w:id="28" w:name="_c04c1fee28616b1455b49abe82fd4dc691d7b9c"/>
+      <w:bookmarkStart w:id="30" w:name="_c04c1fee28616b1455b49abe82fd4dc691d7b9c"/>
       <w:r>
         <w:rPr>
           <w:lang w:val="es"/>
         </w:rPr>
         <w:t xml:space="preserve">4. Base de datos e integridad</w:t>
       </w:r>
-      <w:bookmarkEnd w:id="28"/>
+      <w:bookmarkEnd w:id="30"/>
     </w:p>
     <w:p>
       <w:pPr>
@@ -10710,14 +10771,14 @@
       <w:pPr>
         <w:pStyle w:val="Heading2"/>
       </w:pPr>
-      <w:bookmarkStart w:id="29" w:name="_api"/>
+      <w:bookmarkStart w:id="31" w:name="_api"/>
       <w:r>
         <w:rPr>
           <w:lang w:val="es"/>
         </w:rPr>
         <w:t xml:space="preserve">5. API</w:t>
       </w:r>
-      <w:bookmarkEnd w:id="29"/>
+      <w:bookmarkEnd w:id="31"/>
     </w:p>
     <w:p>
       <w:pPr>
@@ -11365,14 +11426,14 @@
       <w:pPr>
         <w:pStyle w:val="Heading2"/>
       </w:pPr>
-      <w:bookmarkStart w:id="30" w:name="_c7fe59a7f60d691ee159723c29478d98f6d555d"/>
+      <w:bookmarkStart w:id="32" w:name="_c7fe59a7f60d691ee159723c29478d98f6d555d"/>
       <w:r>
         <w:rPr>
           <w:lang w:val="es"/>
         </w:rPr>
         <w:t xml:space="preserve">6. Configuración y seguridad</w:t>
       </w:r>
-      <w:bookmarkEnd w:id="30"/>
+      <w:bookmarkEnd w:id="32"/>
     </w:p>
     <w:p>
       <w:pPr>
@@ -12875,14 +12936,14 @@
       <w:pPr>
         <w:pStyle w:val="Heading2"/>
       </w:pPr>
-      <w:bookmarkStart w:id="31" w:name="_frontend"/>
+      <w:bookmarkStart w:id="33" w:name="_frontend"/>
       <w:r>
         <w:rPr>
           <w:lang w:val="es"/>
         </w:rPr>
         <w:t xml:space="preserve">7. Frontend</w:t>
       </w:r>
-      <w:bookmarkEnd w:id="31"/>
+      <w:bookmarkEnd w:id="33"/>
     </w:p>
     <w:p>
       <w:pPr>
@@ -13708,27 +13769,27 @@
       <w:pPr>
         <w:pStyle w:val="Heading2"/>
       </w:pPr>
-      <w:bookmarkStart w:id="32" w:name="_53e313dab6c474533c888c00a4d05bfcbdaf16b"/>
+      <w:bookmarkStart w:id="34" w:name="_53e313dab6c474533c888c00a4d05bfcbdaf16b"/>
       <w:r>
         <w:rPr>
           <w:lang w:val="es"/>
         </w:rPr>
         <w:t xml:space="preserve">8. Infraestructura, deploy y CI</w:t>
       </w:r>
-      <w:bookmarkEnd w:id="32"/>
+      <w:bookmarkEnd w:id="34"/>
     </w:p>
     <w:p>
       <w:pPr>
         <w:pStyle w:val="Heading3"/>
       </w:pPr>
-      <w:bookmarkStart w:id="33" w:name="_docker"/>
+      <w:bookmarkStart w:id="35" w:name="_docker"/>
       <w:r>
         <w:rPr>
           <w:lang w:val="es"/>
         </w:rPr>
         <w:t xml:space="preserve">Docker</w:t>
       </w:r>
-      <w:bookmarkEnd w:id="33"/>
+      <w:bookmarkEnd w:id="35"/>
     </w:p>
     <w:p>
       <w:pPr>
@@ -14202,14 +14263,14 @@
       <w:pPr>
         <w:pStyle w:val="Heading3"/>
       </w:pPr>
-      <w:bookmarkStart w:id="34" w:name="_render"/>
+      <w:bookmarkStart w:id="36" w:name="_render"/>
       <w:r>
         <w:rPr>
           <w:lang w:val="es"/>
         </w:rPr>
         <w:t xml:space="preserve">Render</w:t>
       </w:r>
-      <w:bookmarkEnd w:id="34"/>
+      <w:bookmarkEnd w:id="36"/>
     </w:p>
     <w:p>
       <w:pPr>
@@ -14479,14 +14540,14 @@
       <w:pPr>
         <w:pStyle w:val="Heading3"/>
       </w:pPr>
-      <w:bookmarkStart w:id="35" w:name="_vercel"/>
+      <w:bookmarkStart w:id="37" w:name="_vercel"/>
       <w:r>
         <w:rPr>
           <w:lang w:val="es"/>
         </w:rPr>
         <w:t xml:space="preserve">Vercel</w:t>
       </w:r>
-      <w:bookmarkEnd w:id="35"/>
+      <w:bookmarkEnd w:id="37"/>
     </w:p>
     <w:p>
       <w:pPr>
@@ -14601,14 +14662,14 @@
       <w:pPr>
         <w:pStyle w:val="Heading3"/>
       </w:pPr>
-      <w:bookmarkStart w:id="36" w:name="_624755df09264972c680fd3607a4c83a4be96d9"/>
+      <w:bookmarkStart w:id="38" w:name="_624755df09264972c680fd3607a4c83a4be96d9"/>
       <w:r>
         <w:rPr>
           <w:lang w:val="es"/>
         </w:rPr>
         <w:t xml:space="preserve">GitHub Actions</w:t>
       </w:r>
-      <w:bookmarkEnd w:id="36"/>
+      <w:bookmarkEnd w:id="38"/>
     </w:p>
     <w:p>
       <w:pPr>
@@ -14787,14 +14848,14 @@
       <w:pPr>
         <w:pStyle w:val="Heading2"/>
       </w:pPr>
-      <w:bookmarkStart w:id="37" w:name="_371fabc5b95fec98c52870ada4c48118097734f"/>
+      <w:bookmarkStart w:id="39" w:name="_371fabc5b95fec98c52870ada4c48118097734f"/>
       <w:r>
         <w:rPr>
           <w:lang w:val="es"/>
         </w:rPr>
         <w:t xml:space="preserve">9. Testing y calidad</w:t>
       </w:r>
-      <w:bookmarkEnd w:id="37"/>
+      <w:bookmarkEnd w:id="39"/>
     </w:p>
     <w:p>
       <w:pPr>
@@ -15254,14 +15315,14 @@
       <w:pPr>
         <w:pStyle w:val="Heading2"/>
       </w:pPr>
-      <w:bookmarkStart w:id="38" w:name="_4c67f4cd99e9e7d480c689ab65bb45b5742e586"/>
+      <w:bookmarkStart w:id="40" w:name="_4c67f4cd99e9e7d480c689ab65bb45b5742e586"/>
       <w:r>
         <w:rPr>
           <w:lang w:val="es"/>
         </w:rPr>
         <w:t xml:space="preserve">10. Decisiones de diseño (ADRs)</w:t>
       </w:r>
-      <w:bookmarkEnd w:id="38"/>
+      <w:bookmarkEnd w:id="40"/>
     </w:p>
     <w:tbl>
       <w:tblPr>
@@ -15821,14 +15882,14 @@
       <w:pPr>
         <w:pStyle w:val="Heading2"/>
       </w:pPr>
-      <w:bookmarkStart w:id="39" w:name="_c4f094e0e32999abd1c8f46158d0233c9c1dad8"/>
+      <w:bookmarkStart w:id="41" w:name="_c4f094e0e32999abd1c8f46158d0233c9c1dad8"/>
       <w:r>
         <w:rPr>
           <w:lang w:val="es"/>
         </w:rPr>
         <w:t xml:space="preserve">11. Qué está implementado y qué falta</w:t>
       </w:r>
-      <w:bookmarkEnd w:id="39"/>
+      <w:bookmarkEnd w:id="41"/>
     </w:p>
     <w:p>
       <w:pPr>
@@ -16160,14 +16221,14 @@
       <w:pPr>
         <w:pStyle w:val="Heading2"/>
       </w:pPr>
-      <w:bookmarkStart w:id="40" w:name="_88126bfdaf0bad02332eefbbccc58dd49c6f1ec"/>
+      <w:bookmarkStart w:id="42" w:name="_88126bfdaf0bad02332eefbbccc58dd49c6f1ec"/>
       <w:r>
         <w:rPr>
           <w:lang w:val="es"/>
         </w:rPr>
         <w:t xml:space="preserve">12. Mapa rápido y comandos</w:t>
       </w:r>
-      <w:bookmarkEnd w:id="40"/>
+      <w:bookmarkEnd w:id="42"/>
     </w:p>
     <w:p>
       <w:pPr>

</xml_diff>